<commit_message>
adding test dropdowns updating database
</commit_message>
<xml_diff>
--- a/help/MySQL presenter Tables.docx
+++ b/help/MySQL presenter Tables.docx
@@ -4,7 +4,18 @@
   <w:body>
     <w:p>
       <w:r>
-        <w:br/>
+        <w:rPr>
+          <w:b/>
+          <w:bCs/>
+        </w:rPr>
+        <w:br/>
+      </w:r>
+      <w:bookmarkStart w:id="0" w:name="OLE_LINK3"/>
+      <w:r>
+        <w:rPr>
+          <w:b/>
+          <w:bCs/>
+        </w:rPr>
         <w:t>MySQL presenterTable:</w:t>
       </w:r>
       <w:r>
@@ -13,6 +24,15 @@
       </w:r>
       <w:r>
         <w:br/>
+      </w:r>
+      <w:r>
+        <w:t>folder: varchar</w:t>
+      </w:r>
+      <w:r>
+        <w:t xml:space="preserve"> unique index</w:t>
+      </w:r>
+      <w:r>
+        <w:br/>
         <w:t>presenterName: char</w:t>
       </w:r>
       <w:r>
@@ -26,6 +46,12 @@
         <w:t>:</w:t>
       </w:r>
       <w:r>
+        <w:t xml:space="preserve"> varchar</w:t>
+      </w:r>
+      <w:r>
+        <w:t>-</w:t>
+      </w:r>
+      <w:r>
         <w:br/>
         <w:t>locationAddress</w:t>
       </w:r>
@@ -67,6 +93,10 @@
         <w:br/>
       </w:r>
       <w:r>
+        <w:rPr>
+          <w:b/>
+          <w:bCs/>
+        </w:rPr>
         <w:br/>
         <w:t>MySQL presentationTable:</w:t>
       </w:r>
@@ -80,15 +110,73 @@
       </w:r>
       <w:r>
         <w:br/>
+      </w:r>
+      <w:r>
+        <w:rPr>
+          <w:rFonts w:asciiTheme="minorHAnsi" w:hAnsiTheme="minorHAnsi"/>
+        </w:rPr>
         <w:t>slideshowID: char</w:t>
       </w:r>
       <w:r>
-        <w:br/>
-        <w:t>startTime: char</w:t>
-      </w:r>
-      <w:r>
-        <w:br/>
-        <w:t>presentationID: generated field of above three columns</w:t>
+        <w:rPr>
+          <w:rFonts w:asciiTheme="minorHAnsi" w:hAnsiTheme="minorHAnsi"/>
+        </w:rPr>
+        <w:br/>
+        <w:t>presentationDate: date</w:t>
+      </w:r>
+      <w:r>
+        <w:rPr>
+          <w:rFonts w:asciiTheme="minorHAnsi" w:hAnsiTheme="minorHAnsi"/>
+        </w:rPr>
+        <w:br/>
+        <w:t>start</w:t>
+      </w:r>
+      <w:r>
+        <w:rPr>
+          <w:rFonts w:asciiTheme="minorHAnsi" w:hAnsiTheme="minorHAnsi"/>
+        </w:rPr>
+        <w:t>Hour</w:t>
+      </w:r>
+      <w:r>
+        <w:rPr>
+          <w:rFonts w:asciiTheme="minorHAnsi" w:hAnsiTheme="minorHAnsi"/>
+        </w:rPr>
+        <w:t>Minute</w:t>
+      </w:r>
+      <w:r>
+        <w:rPr>
+          <w:rFonts w:asciiTheme="minorHAnsi" w:hAnsiTheme="minorHAnsi"/>
+        </w:rPr>
+        <w:t xml:space="preserve">: </w:t>
+      </w:r>
+      <w:r>
+        <w:rPr>
+          <w:rFonts w:asciiTheme="minorHAnsi" w:hAnsiTheme="minorHAnsi"/>
+          <w:color w:val="000000"/>
+          <w:sz w:val="23"/>
+          <w:szCs w:val="23"/>
+          <w:shd w:val="clear" w:color="auto" w:fill="FFFFFF"/>
+        </w:rPr>
+        <w:t>int</w:t>
+      </w:r>
+      <w:r>
+        <w:br/>
+        <w:t xml:space="preserve">presentationID: generated field of above </w:t>
+      </w:r>
+      <w:r>
+        <w:t>four</w:t>
+      </w:r>
+      <w:r>
+        <w:t xml:space="preserve"> columns</w:t>
+      </w:r>
+      <w:r>
+        <w:br/>
+      </w:r>
+      <w:r>
+        <w:t>presenterName</w:t>
+      </w:r>
+      <w:r>
+        <w:t xml:space="preserve"> char</w:t>
       </w:r>
       <w:r>
         <w:br/>
@@ -97,41 +185,49 @@
       <w:r>
         <w:br/>
       </w:r>
-      <w:bookmarkStart w:id="0" w:name="OLE_LINK2"/>
+      <w:bookmarkStart w:id="1" w:name="OLE_LINK2"/>
       <w:r>
         <w:t>showStartedFlag</w:t>
       </w:r>
-      <w:bookmarkEnd w:id="0"/>
+      <w:bookmarkEnd w:id="1"/>
       <w:r>
         <w:t>: int</w:t>
       </w:r>
       <w:r>
         <w:br/>
-        <w:t>begin time: date(</w:t>
-      </w:r>
-      <w:proofErr w:type="spellStart"/>
-      <w:r>
-        <w:t>YYYYMMDDHHmm</w:t>
-      </w:r>
-      <w:proofErr w:type="spellEnd"/>
-      <w:r>
-        <w:t>)</w:t>
-      </w:r>
-      <w:r>
-        <w:br/>
-        <w:t>end time: date(</w:t>
-      </w:r>
-      <w:proofErr w:type="spellStart"/>
-      <w:r>
-        <w:t>YYYYMMDDHHmm</w:t>
-      </w:r>
-      <w:proofErr w:type="spellEnd"/>
-      <w:r>
-        <w:t>)</w:t>
+        <w:t xml:space="preserve">begin time: </w:t>
+      </w:r>
+      <w:r>
+        <w:rPr>
+          <w:rFonts w:ascii="Segoe UI" w:hAnsi="Segoe UI" w:cs="Segoe UI"/>
+          <w:color w:val="000000"/>
+          <w:shd w:val="clear" w:color="auto" w:fill="FFFFFF"/>
+        </w:rPr>
+        <w:t>DATETIME</w:t>
+      </w:r>
+      <w:r>
+        <w:t xml:space="preserve"> </w:t>
+      </w:r>
+      <w:r>
+        <w:br/>
+      </w:r>
+      <w:r>
+        <w:t xml:space="preserve">end time: </w:t>
+      </w:r>
+      <w:r>
+        <w:rPr>
+          <w:rFonts w:ascii="Segoe UI" w:hAnsi="Segoe UI" w:cs="Segoe UI"/>
+          <w:color w:val="000000"/>
+          <w:shd w:val="clear" w:color="auto" w:fill="FFFFFF"/>
+        </w:rPr>
+        <w:t>DATETIME</w:t>
       </w:r>
     </w:p>
     <w:p>
       <w:r>
+        <w:rPr>
+          <w:b/>
+        </w:rPr>
         <w:t>MySQL playerTable</w:t>
       </w:r>
       <w:r>
@@ -139,8 +235,37 @@
         <w:t>ID: primary key</w:t>
       </w:r>
       <w:r>
-        <w:br/>
-        <w:t>presentationID: char</w:t>
+        <w:rPr>
+          <w:strike/>
+        </w:rPr>
+        <w:br/>
+      </w:r>
+      <w:r>
+        <w:t>presenterName</w:t>
+      </w:r>
+      <w:r>
+        <w:rPr>
+          <w:strike/>
+        </w:rPr>
+        <w:br/>
+      </w:r>
+      <w:r>
+        <w:t>date: currentDate</w:t>
+      </w:r>
+      <w:r>
+        <w:br/>
+      </w:r>
+      <w:r>
+        <w:rPr>
+          <w:rFonts w:asciiTheme="minorHAnsi" w:hAnsiTheme="minorHAnsi"/>
+        </w:rPr>
+        <w:t>start</w:t>
+      </w:r>
+      <w:r>
+        <w:rPr>
+          <w:rFonts w:asciiTheme="minorHAnsi" w:hAnsiTheme="minorHAnsi"/>
+        </w:rPr>
+        <w:t>HourMinute: int</w:t>
       </w:r>
       <w:r>
         <w:br/>
@@ -148,18 +273,37 @@
       </w:r>
       <w:r>
         <w:br/>
-        <w:t>loggedIn: int</w:t>
-      </w:r>
-      <w:r>
-        <w:br/>
-        <w:t>ActiveFlag: int</w:t>
-      </w:r>
-      <w:r>
-        <w:br/>
-      </w:r>
-      <w:r>
-        <w:br/>
-        <w:t xml:space="preserve">MySQL playersScoreboardTable: </w:t>
+      </w:r>
+      <w:r>
+        <w:t>logedIn</w:t>
+      </w:r>
+      <w:r>
+        <w:t>: int</w:t>
+      </w:r>
+      <w:r>
+        <w:br/>
+      </w:r>
+      <w:r>
+        <w:t>a</w:t>
+      </w:r>
+      <w:r>
+        <w:t>ctiveFlag: int</w:t>
+      </w:r>
+      <w:r>
+        <w:br/>
+      </w:r>
+      <w:r>
+        <w:br/>
+      </w:r>
+      <w:r>
+        <w:rPr>
+          <w:b/>
+          <w:bCs/>
+        </w:rPr>
+        <w:t>MySQL playersScoreboardTable:</w:t>
+      </w:r>
+      <w:r>
+        <w:t xml:space="preserve"> </w:t>
       </w:r>
       <w:r>
         <w:br/>
@@ -167,49 +311,77 @@
       </w:r>
       <w:r>
         <w:br/>
-        <w:t>presentationID: char</w:t>
-      </w:r>
-      <w:r>
-        <w:br/>
-        <w:t>playerID: char</w:t>
-      </w:r>
-      <w:r>
-        <w:br/>
-        <w:t>questionKey: char.</w:t>
-      </w:r>
-      <w:r>
-        <w:br/>
-        <w:t>question: varchar</w:t>
-      </w:r>
-      <w:r>
-        <w:br/>
-        <w:t>answerKey: char</w:t>
-      </w:r>
-      <w:r>
-        <w:br/>
-        <w:t>answerText: varchar</w:t>
-      </w:r>
-      <w:r>
-        <w:br/>
-      </w:r>
-      <w:proofErr w:type="gramStart"/>
-      <w:r>
-        <w:t>correctFlag :</w:t>
-      </w:r>
-      <w:proofErr w:type="gramEnd"/>
+        <w:t xml:space="preserve">presentationID: </w:t>
+      </w:r>
+      <w:r>
+        <w:t>int</w:t>
+      </w:r>
+      <w:r>
+        <w:br/>
+        <w:t xml:space="preserve">playerID: </w:t>
+      </w:r>
+      <w:r>
+        <w:t>int</w:t>
+      </w:r>
+      <w:r>
+        <w:br/>
+      </w:r>
+      <w:r>
+        <w:t>currentQ</w:t>
+      </w:r>
+      <w:r>
+        <w:t>uestionKey: char.</w:t>
+      </w:r>
+      <w:r>
+        <w:br/>
+      </w:r>
+      <w:r>
+        <w:t>currentA</w:t>
+      </w:r>
+      <w:r>
+        <w:t>nswerKey: char</w:t>
+      </w:r>
+      <w:r>
+        <w:br/>
+      </w:r>
+      <w:r>
+        <w:t>c</w:t>
+      </w:r>
+      <w:r>
+        <w:t>urrentC</w:t>
+      </w:r>
+      <w:r>
+        <w:t>orrectFlag:</w:t>
+      </w:r>
       <w:r>
         <w:t xml:space="preserve"> int</w:t>
       </w:r>
       <w:r>
         <w:br/>
-        <w:t>incorrectCount: int</w:t>
-      </w:r>
-      <w:r>
-        <w:br/>
-      </w:r>
-      <w:r>
-        <w:br/>
-      </w:r>
+      </w:r>
+      <w:r>
+        <w:t>current</w:t>
+      </w:r>
+      <w:r>
+        <w:t>C</w:t>
+      </w:r>
+      <w:r>
+        <w:t>orrectCount: int</w:t>
+      </w:r>
+      <w:r>
+        <w:t xml:space="preserve"> </w:t>
+      </w:r>
+      <w:r>
+        <w:br/>
+        <w:t>currentIncorrectCount: int</w:t>
+      </w:r>
+      <w:r>
+        <w:br/>
+      </w:r>
+      <w:r>
+        <w:br/>
+      </w:r>
+      <w:bookmarkEnd w:id="0"/>
     </w:p>
     <w:sectPr>
       <w:pgSz w:w="12240" w:h="15840"/>

</xml_diff>